<commit_message>
Update docker compose guideline doc
</commit_message>
<xml_diff>
--- a/week3-docker-sqlalchemy/day5/Docker-Step-by-Step-approach.docx
+++ b/week3-docker-sqlalchemy/day5/Docker-Step-by-Step-approach.docx
@@ -13,7 +13,6 @@
           <w:ilvl w:val="0"/>
           <w:numId w:val="1"/>
         </w:numPr>
-        <w:pBdr/>
         <w:shd w:val="clear" w:fill="auto"/>
         <w:spacing w:lineRule="auto" w:line="259" w:before="0" w:after="0"/>
         <w:ind w:hanging="360" w:left="-360" w:right="0"/>
@@ -91,7 +90,6 @@
         <w:keepLines w:val="false"/>
         <w:pageBreakBefore w:val="false"/>
         <w:widowControl/>
-        <w:pBdr/>
         <w:shd w:val="clear" w:fill="auto"/>
         <w:spacing w:lineRule="auto" w:line="259" w:before="0" w:after="0"/>
         <w:ind w:hanging="360" w:left="-360" w:right="0"/>
@@ -147,7 +145,6 @@
         <w:keepLines w:val="false"/>
         <w:pageBreakBefore w:val="false"/>
         <w:widowControl/>
-        <w:pBdr/>
         <w:shd w:val="clear" w:fill="auto"/>
         <w:spacing w:lineRule="auto" w:line="259" w:before="0" w:after="0"/>
         <w:ind w:hanging="360" w:left="-360" w:right="0"/>
@@ -207,7 +204,6 @@
           <w:ilvl w:val="0"/>
           <w:numId w:val="10"/>
         </w:numPr>
-        <w:pBdr/>
         <w:shd w:val="clear" w:fill="auto"/>
         <w:spacing w:lineRule="auto" w:line="259" w:before="0" w:after="0"/>
         <w:ind w:hanging="360" w:left="-360" w:right="0"/>
@@ -244,7 +240,6 @@
         <w:keepLines w:val="false"/>
         <w:pageBreakBefore w:val="false"/>
         <w:widowControl/>
-        <w:pBdr/>
         <w:shd w:val="clear" w:fill="auto"/>
         <w:spacing w:lineRule="auto" w:line="259" w:before="0" w:after="0"/>
         <w:ind w:hanging="360" w:left="-360" w:right="0"/>
@@ -322,7 +317,6 @@
           <w:ilvl w:val="0"/>
           <w:numId w:val="10"/>
         </w:numPr>
-        <w:pBdr/>
         <w:shd w:val="clear" w:fill="auto"/>
         <w:spacing w:lineRule="auto" w:line="259" w:before="0" w:after="0"/>
         <w:ind w:hanging="360" w:left="-360" w:right="0"/>
@@ -359,7 +353,6 @@
         <w:keepLines w:val="false"/>
         <w:pageBreakBefore w:val="false"/>
         <w:widowControl/>
-        <w:pBdr/>
         <w:shd w:val="clear" w:fill="auto"/>
         <w:spacing w:lineRule="auto" w:line="259" w:before="0" w:after="0"/>
         <w:ind w:hanging="360" w:left="-360" w:right="0"/>
@@ -437,7 +430,6 @@
           <w:ilvl w:val="0"/>
           <w:numId w:val="10"/>
         </w:numPr>
-        <w:pBdr/>
         <w:shd w:val="clear" w:fill="auto"/>
         <w:spacing w:lineRule="auto" w:line="259" w:before="0" w:after="0"/>
         <w:ind w:hanging="360" w:left="-360" w:right="0"/>
@@ -474,7 +466,6 @@
         <w:keepLines w:val="false"/>
         <w:pageBreakBefore w:val="false"/>
         <w:widowControl/>
-        <w:pBdr/>
         <w:shd w:val="clear" w:fill="auto"/>
         <w:spacing w:lineRule="auto" w:line="259" w:before="0" w:after="0"/>
         <w:ind w:hanging="360" w:left="-360" w:right="0"/>
@@ -552,7 +543,6 @@
           <w:ilvl w:val="0"/>
           <w:numId w:val="10"/>
         </w:numPr>
-        <w:pBdr/>
         <w:shd w:val="clear" w:fill="auto"/>
         <w:spacing w:lineRule="auto" w:line="259" w:before="0" w:after="0"/>
         <w:ind w:hanging="360" w:left="-360" w:right="0"/>
@@ -593,7 +583,6 @@
           <w:ilvl w:val="0"/>
           <w:numId w:val="10"/>
         </w:numPr>
-        <w:pBdr/>
         <w:shd w:val="clear" w:fill="auto"/>
         <w:spacing w:lineRule="auto" w:line="259" w:before="0" w:after="0"/>
         <w:ind w:hanging="360" w:left="-360" w:right="0"/>
@@ -630,7 +619,6 @@
         <w:keepLines w:val="false"/>
         <w:pageBreakBefore w:val="false"/>
         <w:widowControl/>
-        <w:pBdr/>
         <w:shd w:val="clear" w:fill="auto"/>
         <w:spacing w:lineRule="auto" w:line="259" w:before="0" w:after="0"/>
         <w:ind w:hanging="360" w:left="-360" w:right="0"/>
@@ -685,7 +673,6 @@
         <w:keepLines w:val="false"/>
         <w:pageBreakBefore w:val="false"/>
         <w:widowControl/>
-        <w:pBdr/>
         <w:shd w:val="clear" w:fill="auto"/>
         <w:spacing w:lineRule="auto" w:line="259" w:before="0" w:after="0"/>
         <w:ind w:hanging="360" w:left="-360" w:right="0"/>
@@ -740,7 +727,6 @@
         <w:keepLines w:val="false"/>
         <w:pageBreakBefore w:val="false"/>
         <w:widowControl/>
-        <w:pBdr/>
         <w:shd w:val="clear" w:fill="auto"/>
         <w:spacing w:lineRule="auto" w:line="259" w:before="0" w:after="0"/>
         <w:ind w:hanging="360" w:left="-360" w:right="0"/>
@@ -799,7 +785,6 @@
           <w:ilvl w:val="0"/>
           <w:numId w:val="1"/>
         </w:numPr>
-        <w:pBdr/>
         <w:shd w:val="clear" w:fill="auto"/>
         <w:spacing w:lineRule="auto" w:line="259" w:before="0" w:after="0"/>
         <w:ind w:hanging="360" w:left="-360" w:right="0"/>
@@ -840,7 +825,6 @@
           <w:ilvl w:val="0"/>
           <w:numId w:val="11"/>
         </w:numPr>
-        <w:pBdr/>
         <w:shd w:val="clear" w:fill="auto"/>
         <w:spacing w:lineRule="auto" w:line="259" w:before="0" w:after="0"/>
         <w:ind w:hanging="360" w:left="-360" w:right="0"/>
@@ -877,7 +861,6 @@
         <w:keepLines w:val="false"/>
         <w:pageBreakBefore w:val="false"/>
         <w:widowControl/>
-        <w:pBdr/>
         <w:shd w:val="clear" w:fill="auto"/>
         <w:spacing w:lineRule="auto" w:line="259" w:before="0" w:after="0"/>
         <w:ind w:hanging="360" w:left="-360" w:right="0"/>
@@ -951,7 +934,6 @@
         <w:keepLines w:val="false"/>
         <w:pageBreakBefore w:val="false"/>
         <w:widowControl/>
-        <w:pBdr/>
         <w:shd w:val="clear" w:fill="auto"/>
         <w:spacing w:lineRule="auto" w:line="259" w:before="0" w:after="0"/>
         <w:ind w:hanging="360" w:left="-360" w:right="0"/>
@@ -1010,7 +992,6 @@
           <w:ilvl w:val="0"/>
           <w:numId w:val="11"/>
         </w:numPr>
-        <w:pBdr/>
         <w:shd w:val="clear" w:fill="auto"/>
         <w:spacing w:lineRule="auto" w:line="259" w:before="0" w:after="0"/>
         <w:ind w:hanging="360" w:left="-360" w:right="0"/>
@@ -1047,7 +1028,6 @@
         <w:keepLines w:val="false"/>
         <w:pageBreakBefore w:val="false"/>
         <w:widowControl/>
-        <w:pBdr/>
         <w:shd w:val="clear" w:fill="auto"/>
         <w:spacing w:lineRule="auto" w:line="259" w:before="0" w:after="0"/>
         <w:ind w:hanging="360" w:left="-360" w:right="0"/>
@@ -1121,7 +1101,6 @@
         <w:keepLines w:val="false"/>
         <w:pageBreakBefore w:val="false"/>
         <w:widowControl/>
-        <w:pBdr/>
         <w:shd w:val="clear" w:fill="auto"/>
         <w:spacing w:lineRule="auto" w:line="259" w:before="0" w:after="0"/>
         <w:ind w:hanging="360" w:left="-360" w:right="0"/>
@@ -1180,7 +1159,6 @@
           <w:ilvl w:val="0"/>
           <w:numId w:val="11"/>
         </w:numPr>
-        <w:pBdr/>
         <w:shd w:val="clear" w:fill="auto"/>
         <w:spacing w:lineRule="auto" w:line="259" w:before="0" w:after="0"/>
         <w:ind w:hanging="360" w:left="-360" w:right="0"/>
@@ -1217,7 +1195,6 @@
         <w:keepLines w:val="false"/>
         <w:pageBreakBefore w:val="false"/>
         <w:widowControl/>
-        <w:pBdr/>
         <w:shd w:val="clear" w:fill="auto"/>
         <w:spacing w:lineRule="auto" w:line="259" w:before="0" w:after="0"/>
         <w:ind w:hanging="360" w:left="-360" w:right="0"/>
@@ -1291,7 +1268,6 @@
         <w:keepLines w:val="false"/>
         <w:pageBreakBefore w:val="false"/>
         <w:widowControl/>
-        <w:pBdr/>
         <w:shd w:val="clear" w:fill="auto"/>
         <w:spacing w:lineRule="auto" w:line="259" w:before="0" w:after="0"/>
         <w:ind w:hanging="360" w:left="-360" w:right="0"/>
@@ -1350,7 +1326,6 @@
           <w:ilvl w:val="0"/>
           <w:numId w:val="1"/>
         </w:numPr>
-        <w:pBdr/>
         <w:shd w:val="clear" w:fill="auto"/>
         <w:spacing w:lineRule="auto" w:line="259" w:before="0" w:after="0"/>
         <w:ind w:hanging="360" w:left="-360" w:right="0"/>
@@ -1387,7 +1362,6 @@
         <w:keepLines w:val="false"/>
         <w:pageBreakBefore w:val="false"/>
         <w:widowControl/>
-        <w:pBdr/>
         <w:shd w:val="clear" w:fill="auto"/>
         <w:spacing w:lineRule="auto" w:line="259" w:before="0" w:after="0"/>
         <w:ind w:hanging="360" w:left="-360" w:right="0"/>
@@ -1447,7 +1421,6 @@
           <w:ilvl w:val="0"/>
           <w:numId w:val="12"/>
         </w:numPr>
-        <w:pBdr/>
         <w:shd w:val="clear" w:fill="auto"/>
         <w:spacing w:lineRule="auto" w:line="259" w:before="0" w:after="0"/>
         <w:ind w:hanging="360" w:left="-360" w:right="0"/>
@@ -1484,7 +1457,6 @@
         <w:keepLines w:val="false"/>
         <w:pageBreakBefore w:val="false"/>
         <w:widowControl/>
-        <w:pBdr/>
         <w:shd w:val="clear" w:fill="auto"/>
         <w:spacing w:lineRule="auto" w:line="259" w:before="0" w:after="0"/>
         <w:ind w:hanging="360" w:left="-360" w:right="0"/>
@@ -1540,7 +1512,6 @@
         <w:keepLines w:val="false"/>
         <w:pageBreakBefore w:val="false"/>
         <w:widowControl/>
-        <w:pBdr/>
         <w:shd w:val="clear" w:fill="auto"/>
         <w:spacing w:lineRule="auto" w:line="259" w:before="0" w:after="0"/>
         <w:ind w:hanging="360" w:left="-360" w:right="0"/>
@@ -1618,7 +1589,6 @@
           <w:ilvl w:val="0"/>
           <w:numId w:val="12"/>
         </w:numPr>
-        <w:pBdr/>
         <w:shd w:val="clear" w:fill="auto"/>
         <w:spacing w:lineRule="auto" w:line="259" w:before="0" w:after="160"/>
         <w:ind w:hanging="360" w:left="-360" w:right="0"/>
@@ -1706,7 +1676,6 @@
           <w:ilvl w:val="0"/>
           <w:numId w:val="12"/>
         </w:numPr>
-        <w:pBdr/>
         <w:shd w:val="clear" w:fill="auto"/>
         <w:spacing w:lineRule="auto" w:line="259" w:before="0" w:after="0"/>
         <w:ind w:hanging="360" w:left="-360" w:right="0"/>
@@ -1743,7 +1712,6 @@
         <w:keepLines w:val="false"/>
         <w:pageBreakBefore w:val="false"/>
         <w:widowControl/>
-        <w:pBdr/>
         <w:shd w:val="clear" w:fill="auto"/>
         <w:spacing w:lineRule="auto" w:line="259" w:before="0" w:after="0"/>
         <w:ind w:hanging="360" w:left="-360" w:right="0"/>
@@ -1817,7 +1785,6 @@
         <w:keepLines w:val="false"/>
         <w:pageBreakBefore w:val="false"/>
         <w:widowControl/>
-        <w:pBdr/>
         <w:shd w:val="clear" w:fill="auto"/>
         <w:spacing w:lineRule="auto" w:line="259" w:before="0" w:after="0"/>
         <w:ind w:hanging="360" w:left="-360" w:right="0"/>
@@ -1876,7 +1843,6 @@
           <w:ilvl w:val="0"/>
           <w:numId w:val="12"/>
         </w:numPr>
-        <w:pBdr/>
         <w:shd w:val="clear" w:fill="auto"/>
         <w:spacing w:lineRule="auto" w:line="259" w:before="0" w:after="0"/>
         <w:ind w:hanging="360" w:left="-360" w:right="0"/>
@@ -1913,7 +1879,6 @@
         <w:keepLines w:val="false"/>
         <w:pageBreakBefore w:val="false"/>
         <w:widowControl/>
-        <w:pBdr/>
         <w:shd w:val="clear" w:fill="auto"/>
         <w:spacing w:lineRule="auto" w:line="259" w:before="0" w:after="0"/>
         <w:ind w:hanging="360" w:left="-360" w:right="0"/>
@@ -1987,7 +1952,6 @@
         <w:keepLines w:val="false"/>
         <w:pageBreakBefore w:val="false"/>
         <w:widowControl/>
-        <w:pBdr/>
         <w:shd w:val="clear" w:fill="auto"/>
         <w:spacing w:lineRule="auto" w:line="259" w:before="0" w:after="0"/>
         <w:ind w:hanging="360" w:left="-360" w:right="0"/>
@@ -2042,7 +2006,6 @@
         <w:keepLines w:val="false"/>
         <w:pageBreakBefore w:val="false"/>
         <w:widowControl/>
-        <w:pBdr/>
         <w:shd w:val="clear" w:fill="auto"/>
         <w:spacing w:lineRule="auto" w:line="259" w:before="0" w:after="0"/>
         <w:ind w:hanging="360" w:left="-360" w:right="0"/>
@@ -2097,7 +2060,6 @@
         <w:keepLines w:val="false"/>
         <w:pageBreakBefore w:val="false"/>
         <w:widowControl/>
-        <w:pBdr/>
         <w:shd w:val="clear" w:fill="auto"/>
         <w:spacing w:lineRule="auto" w:line="259" w:before="0" w:after="0"/>
         <w:ind w:hanging="360" w:left="-360" w:right="0"/>
@@ -2157,7 +2119,6 @@
           <w:ilvl w:val="0"/>
           <w:numId w:val="13"/>
         </w:numPr>
-        <w:pBdr/>
         <w:shd w:val="clear" w:fill="auto"/>
         <w:spacing w:lineRule="auto" w:line="259" w:before="0" w:after="0"/>
         <w:ind w:hanging="360" w:left="-360" w:right="0"/>
@@ -2194,7 +2155,6 @@
         <w:keepLines w:val="false"/>
         <w:pageBreakBefore w:val="false"/>
         <w:widowControl/>
-        <w:pBdr/>
         <w:shd w:val="clear" w:fill="auto"/>
         <w:spacing w:lineRule="auto" w:line="259" w:before="0" w:after="0"/>
         <w:ind w:hanging="360" w:left="-360" w:right="0"/>
@@ -2272,7 +2232,6 @@
           <w:ilvl w:val="0"/>
           <w:numId w:val="13"/>
         </w:numPr>
-        <w:pBdr/>
         <w:shd w:val="clear" w:fill="auto"/>
         <w:spacing w:lineRule="auto" w:line="259" w:before="0" w:after="0"/>
         <w:ind w:hanging="360" w:left="-360" w:right="0"/>
@@ -2309,7 +2268,6 @@
         <w:keepLines w:val="false"/>
         <w:pageBreakBefore w:val="false"/>
         <w:widowControl/>
-        <w:pBdr/>
         <w:shd w:val="clear" w:fill="auto"/>
         <w:spacing w:lineRule="auto" w:line="259" w:before="0" w:after="0"/>
         <w:ind w:hanging="360" w:left="-360" w:right="0"/>
@@ -2387,7 +2345,6 @@
           <w:ilvl w:val="0"/>
           <w:numId w:val="13"/>
         </w:numPr>
-        <w:pBdr/>
         <w:shd w:val="clear" w:fill="auto"/>
         <w:spacing w:lineRule="auto" w:line="259" w:before="0" w:after="0"/>
         <w:ind w:hanging="360" w:left="-360" w:right="0"/>
@@ -2428,7 +2385,6 @@
           <w:ilvl w:val="0"/>
           <w:numId w:val="13"/>
         </w:numPr>
-        <w:pBdr/>
         <w:shd w:val="clear" w:fill="auto"/>
         <w:spacing w:lineRule="auto" w:line="259" w:before="0" w:after="0"/>
         <w:ind w:hanging="360" w:left="-360" w:right="0"/>
@@ -2469,7 +2425,6 @@
           <w:ilvl w:val="0"/>
           <w:numId w:val="13"/>
         </w:numPr>
-        <w:pBdr/>
         <w:shd w:val="clear" w:fill="auto"/>
         <w:spacing w:lineRule="auto" w:line="259" w:before="0" w:after="0"/>
         <w:ind w:hanging="360" w:left="-360" w:right="0"/>
@@ -2506,7 +2461,6 @@
         <w:keepLines w:val="false"/>
         <w:pageBreakBefore w:val="false"/>
         <w:widowControl/>
-        <w:pBdr/>
         <w:shd w:val="clear" w:fill="auto"/>
         <w:spacing w:lineRule="auto" w:line="259" w:before="0" w:after="0"/>
         <w:ind w:hanging="360" w:left="-360" w:right="0"/>
@@ -2584,7 +2538,6 @@
           <w:ilvl w:val="0"/>
           <w:numId w:val="13"/>
         </w:numPr>
-        <w:pBdr/>
         <w:shd w:val="clear" w:fill="auto"/>
         <w:spacing w:lineRule="auto" w:line="259" w:before="0" w:after="0"/>
         <w:ind w:hanging="360" w:left="-360" w:right="0"/>
@@ -2625,7 +2578,6 @@
           <w:ilvl w:val="0"/>
           <w:numId w:val="13"/>
         </w:numPr>
-        <w:pBdr/>
         <w:shd w:val="clear" w:fill="auto"/>
         <w:spacing w:lineRule="auto" w:line="259" w:before="0" w:after="0"/>
         <w:ind w:hanging="360" w:left="-360" w:right="0"/>
@@ -2666,7 +2618,6 @@
           <w:ilvl w:val="0"/>
           <w:numId w:val="13"/>
         </w:numPr>
-        <w:pBdr/>
         <w:shd w:val="clear" w:fill="auto"/>
         <w:spacing w:lineRule="auto" w:line="259" w:before="0" w:after="0"/>
         <w:ind w:hanging="360" w:left="-360" w:right="0"/>
@@ -2703,7 +2654,6 @@
         <w:keepLines w:val="false"/>
         <w:pageBreakBefore w:val="false"/>
         <w:widowControl/>
-        <w:pBdr/>
         <w:shd w:val="clear" w:fill="auto"/>
         <w:spacing w:lineRule="auto" w:line="259" w:before="0" w:after="0"/>
         <w:ind w:hanging="360" w:left="-360" w:right="0"/>
@@ -2777,7 +2727,6 @@
         <w:keepLines w:val="false"/>
         <w:pageBreakBefore w:val="false"/>
         <w:widowControl/>
-        <w:pBdr/>
         <w:shd w:val="clear" w:fill="auto"/>
         <w:spacing w:lineRule="auto" w:line="259" w:before="0" w:after="0"/>
         <w:ind w:hanging="360" w:left="-360" w:right="0"/>
@@ -2832,7 +2781,6 @@
         <w:keepLines w:val="false"/>
         <w:pageBreakBefore w:val="false"/>
         <w:widowControl/>
-        <w:pBdr/>
         <w:shd w:val="clear" w:fill="auto"/>
         <w:spacing w:lineRule="auto" w:line="259" w:before="0" w:after="0"/>
         <w:ind w:hanging="360" w:left="-360" w:right="0"/>
@@ -2888,7 +2836,6 @@
         <w:keepLines w:val="false"/>
         <w:pageBreakBefore w:val="false"/>
         <w:widowControl/>
-        <w:pBdr/>
         <w:shd w:val="clear" w:fill="auto"/>
         <w:spacing w:lineRule="auto" w:line="259" w:before="0" w:after="0"/>
         <w:ind w:hanging="360" w:left="-360" w:right="0"/>
@@ -2948,7 +2895,6 @@
           <w:ilvl w:val="0"/>
           <w:numId w:val="14"/>
         </w:numPr>
-        <w:pBdr/>
         <w:shd w:val="clear" w:fill="auto"/>
         <w:spacing w:lineRule="auto" w:line="259" w:before="0" w:after="0"/>
         <w:ind w:hanging="360" w:left="-360" w:right="0"/>
@@ -2989,7 +2935,6 @@
           <w:ilvl w:val="0"/>
           <w:numId w:val="14"/>
         </w:numPr>
-        <w:pBdr/>
         <w:shd w:val="clear" w:fill="auto"/>
         <w:spacing w:lineRule="auto" w:line="259" w:before="0" w:after="0"/>
         <w:ind w:hanging="360" w:left="-360" w:right="0"/>
@@ -3048,7 +2993,6 @@
         <w:keepLines w:val="false"/>
         <w:pageBreakBefore w:val="false"/>
         <w:widowControl/>
-        <w:pBdr/>
         <w:shd w:val="clear" w:fill="auto"/>
         <w:spacing w:lineRule="auto" w:line="259" w:before="0" w:after="0"/>
         <w:ind w:hanging="360" w:left="-360" w:right="0"/>
@@ -3108,7 +3052,6 @@
           <w:ilvl w:val="0"/>
           <w:numId w:val="15"/>
         </w:numPr>
-        <w:pBdr/>
         <w:shd w:val="clear" w:fill="auto"/>
         <w:spacing w:lineRule="auto" w:line="259" w:before="0" w:after="0"/>
         <w:ind w:hanging="360" w:left="-360" w:right="0"/>
@@ -3149,7 +3092,6 @@
           <w:ilvl w:val="0"/>
           <w:numId w:val="15"/>
         </w:numPr>
-        <w:pBdr/>
         <w:shd w:val="clear" w:fill="auto"/>
         <w:spacing w:lineRule="auto" w:line="259" w:before="0" w:after="0"/>
         <w:ind w:hanging="360" w:left="-360" w:right="0"/>
@@ -3190,7 +3132,6 @@
           <w:ilvl w:val="0"/>
           <w:numId w:val="15"/>
         </w:numPr>
-        <w:pBdr/>
         <w:shd w:val="clear" w:fill="auto"/>
         <w:spacing w:lineRule="auto" w:line="259" w:before="0" w:after="0"/>
         <w:ind w:hanging="360" w:left="-360" w:right="0"/>
@@ -3227,7 +3168,6 @@
         <w:keepLines w:val="false"/>
         <w:pageBreakBefore w:val="false"/>
         <w:widowControl/>
-        <w:pBdr/>
         <w:shd w:val="clear" w:fill="auto"/>
         <w:spacing w:lineRule="auto" w:line="259" w:before="0" w:after="0"/>
         <w:ind w:hanging="360" w:left="-360" w:right="0"/>
@@ -3282,7 +3222,6 @@
         <w:keepLines w:val="false"/>
         <w:pageBreakBefore w:val="false"/>
         <w:widowControl/>
-        <w:pBdr/>
         <w:shd w:val="clear" w:fill="auto"/>
         <w:spacing w:lineRule="auto" w:line="259" w:before="0" w:after="0"/>
         <w:ind w:hanging="360" w:left="-360" w:right="0"/>
@@ -3338,7 +3277,6 @@
         <w:keepLines w:val="false"/>
         <w:pageBreakBefore w:val="false"/>
         <w:widowControl/>
-        <w:pBdr/>
         <w:shd w:val="clear" w:fill="auto"/>
         <w:spacing w:lineRule="auto" w:line="259" w:before="0" w:after="0"/>
         <w:ind w:hanging="360" w:left="-360" w:right="0"/>
@@ -3398,7 +3336,6 @@
           <w:ilvl w:val="0"/>
           <w:numId w:val="16"/>
         </w:numPr>
-        <w:pBdr/>
         <w:shd w:val="clear" w:fill="auto"/>
         <w:spacing w:lineRule="auto" w:line="259" w:before="0" w:after="0"/>
         <w:ind w:hanging="360" w:left="-360" w:right="0"/>
@@ -3439,7 +3376,6 @@
           <w:ilvl w:val="0"/>
           <w:numId w:val="16"/>
         </w:numPr>
-        <w:pBdr/>
         <w:shd w:val="clear" w:fill="auto"/>
         <w:spacing w:lineRule="auto" w:line="259" w:before="0" w:after="0"/>
         <w:ind w:hanging="360" w:left="-360" w:right="0"/>
@@ -3480,7 +3416,6 @@
           <w:ilvl w:val="0"/>
           <w:numId w:val="16"/>
         </w:numPr>
-        <w:pBdr/>
         <w:shd w:val="clear" w:fill="auto"/>
         <w:spacing w:lineRule="auto" w:line="259" w:before="0" w:after="0"/>
         <w:ind w:hanging="360" w:left="-360" w:right="0"/>
@@ -3521,7 +3456,6 @@
           <w:ilvl w:val="0"/>
           <w:numId w:val="16"/>
         </w:numPr>
-        <w:pBdr/>
         <w:shd w:val="clear" w:fill="auto"/>
         <w:spacing w:lineRule="auto" w:line="259" w:before="0" w:after="160"/>
         <w:ind w:hanging="360" w:left="-360" w:right="0"/>
@@ -3715,7 +3649,6 @@
         <w:keepLines w:val="false"/>
         <w:pageBreakBefore w:val="false"/>
         <w:widowControl/>
-        <w:pBdr/>
         <w:shd w:val="clear" w:fill="auto"/>
         <w:spacing w:lineRule="auto" w:line="259" w:before="0" w:after="0"/>
         <w:ind w:hanging="360" w:left="-360" w:right="0"/>
@@ -3771,7 +3704,6 @@
         <w:keepLines w:val="false"/>
         <w:pageBreakBefore w:val="false"/>
         <w:widowControl/>
-        <w:pBdr/>
         <w:shd w:val="clear" w:fill="auto"/>
         <w:spacing w:lineRule="auto" w:line="259" w:before="0" w:after="0"/>
         <w:ind w:hanging="360" w:left="-360" w:right="0"/>
@@ -3827,7 +3759,6 @@
         <w:keepLines w:val="false"/>
         <w:pageBreakBefore w:val="false"/>
         <w:widowControl/>
-        <w:pBdr/>
         <w:shd w:val="clear" w:fill="auto"/>
         <w:spacing w:lineRule="auto" w:line="259" w:before="0" w:after="0"/>
         <w:ind w:hanging="360" w:left="-360" w:right="0"/>
@@ -3882,7 +3813,6 @@
         <w:keepLines w:val="false"/>
         <w:pageBreakBefore w:val="false"/>
         <w:widowControl/>
-        <w:pBdr/>
         <w:shd w:val="clear" w:fill="auto"/>
         <w:spacing w:lineRule="auto" w:line="259" w:before="0" w:after="0"/>
         <w:ind w:hanging="360" w:left="-360" w:right="0"/>
@@ -3942,7 +3872,6 @@
           <w:ilvl w:val="0"/>
           <w:numId w:val="3"/>
         </w:numPr>
-        <w:pBdr/>
         <w:shd w:val="clear" w:fill="auto"/>
         <w:spacing w:lineRule="auto" w:line="259" w:before="0" w:after="0"/>
         <w:ind w:hanging="360" w:left="-360" w:right="0"/>
@@ -3983,7 +3912,6 @@
           <w:ilvl w:val="0"/>
           <w:numId w:val="3"/>
         </w:numPr>
-        <w:pBdr/>
         <w:shd w:val="clear" w:fill="auto"/>
         <w:spacing w:lineRule="auto" w:line="259" w:before="0" w:after="0"/>
         <w:ind w:hanging="360" w:left="-360" w:right="0"/>
@@ -4024,7 +3952,6 @@
           <w:ilvl w:val="0"/>
           <w:numId w:val="3"/>
         </w:numPr>
-        <w:pBdr/>
         <w:shd w:val="clear" w:fill="auto"/>
         <w:spacing w:lineRule="auto" w:line="259" w:before="0" w:after="160"/>
         <w:ind w:hanging="360" w:left="-360" w:right="0"/>
@@ -4841,6 +4768,9 @@
       <w:r>
         <w:rPr/>
       </w:r>
+      <w:r>
+        <w:br w:type="page"/>
+      </w:r>
     </w:p>
     <w:p>
       <w:pPr>
@@ -5176,7 +5106,6 @@
         <w:keepLines w:val="false"/>
         <w:pageBreakBefore w:val="false"/>
         <w:widowControl/>
-        <w:pBdr/>
         <w:shd w:val="clear" w:fill="auto"/>
         <w:spacing w:lineRule="auto" w:line="259" w:before="0" w:after="0"/>
         <w:ind w:hanging="0" w:left="0" w:right="0"/>
@@ -5236,7 +5165,6 @@
         <w:keepLines w:val="false"/>
         <w:pageBreakBefore w:val="false"/>
         <w:widowControl/>
-        <w:pBdr/>
         <w:shd w:val="clear" w:fill="auto"/>
         <w:spacing w:lineRule="auto" w:line="259" w:before="0" w:after="0"/>
         <w:ind w:hanging="630" w:left="540" w:right="0"/>
@@ -5310,7 +5238,6 @@
         <w:keepLines w:val="false"/>
         <w:pageBreakBefore w:val="false"/>
         <w:widowControl/>
-        <w:pBdr/>
         <w:shd w:val="clear" w:fill="auto"/>
         <w:spacing w:lineRule="auto" w:line="259" w:before="0" w:after="0"/>
         <w:ind w:hanging="2610" w:left="2520" w:right="0"/>
@@ -5384,7 +5311,6 @@
         <w:keepLines w:val="false"/>
         <w:pageBreakBefore w:val="false"/>
         <w:widowControl/>
-        <w:pBdr/>
         <w:shd w:val="clear" w:fill="auto"/>
         <w:spacing w:lineRule="auto" w:line="259" w:before="0" w:after="0"/>
         <w:ind w:hanging="2250" w:left="2160" w:right="0"/>
@@ -5439,7 +5365,6 @@
         <w:keepLines w:val="false"/>
         <w:pageBreakBefore w:val="false"/>
         <w:widowControl/>
-        <w:pBdr/>
         <w:shd w:val="clear" w:fill="auto"/>
         <w:spacing w:lineRule="auto" w:line="259" w:before="0" w:after="0"/>
         <w:ind w:hanging="2250" w:left="2160" w:right="0"/>
@@ -5499,7 +5424,6 @@
         <w:keepLines w:val="false"/>
         <w:pageBreakBefore w:val="false"/>
         <w:widowControl/>
-        <w:pBdr/>
         <w:shd w:val="clear" w:fill="auto"/>
         <w:spacing w:lineRule="auto" w:line="259" w:before="0" w:after="0"/>
         <w:ind w:hanging="2250" w:left="2160" w:right="0"/>
@@ -5573,7 +5497,6 @@
         <w:keepLines w:val="false"/>
         <w:pageBreakBefore w:val="false"/>
         <w:widowControl/>
-        <w:pBdr/>
         <w:shd w:val="clear" w:fill="auto"/>
         <w:spacing w:lineRule="auto" w:line="259" w:before="0" w:after="0"/>
         <w:ind w:hanging="0" w:left="0" w:right="0"/>
@@ -5633,7 +5556,6 @@
         <w:keepLines w:val="false"/>
         <w:pageBreakBefore w:val="false"/>
         <w:widowControl/>
-        <w:pBdr/>
         <w:shd w:val="clear" w:fill="auto"/>
         <w:spacing w:lineRule="auto" w:line="259" w:before="0" w:after="0"/>
         <w:ind w:hanging="2610" w:left="2520" w:right="0"/>
@@ -5707,7 +5629,6 @@
         <w:keepLines w:val="false"/>
         <w:pageBreakBefore w:val="false"/>
         <w:widowControl/>
-        <w:pBdr/>
         <w:shd w:val="clear" w:fill="auto"/>
         <w:spacing w:lineRule="auto" w:line="259" w:before="0" w:after="0"/>
         <w:ind w:hanging="2610" w:left="2520" w:right="0"/>
@@ -5762,7 +5683,6 @@
         <w:keepLines w:val="false"/>
         <w:pageBreakBefore w:val="false"/>
         <w:widowControl/>
-        <w:pBdr/>
         <w:shd w:val="clear" w:fill="auto"/>
         <w:spacing w:lineRule="auto" w:line="259" w:before="0" w:after="0"/>
         <w:ind w:hanging="2610" w:left="2520" w:right="0"/>
@@ -5822,7 +5742,6 @@
         <w:keepLines w:val="false"/>
         <w:pageBreakBefore w:val="false"/>
         <w:widowControl/>
-        <w:pBdr/>
         <w:shd w:val="clear" w:fill="auto"/>
         <w:spacing w:lineRule="auto" w:line="259" w:before="0" w:after="0"/>
         <w:ind w:hanging="2610" w:left="2520" w:right="0"/>
@@ -5878,7 +5797,6 @@
         <w:keepLines w:val="false"/>
         <w:pageBreakBefore w:val="false"/>
         <w:widowControl/>
-        <w:pBdr/>
         <w:shd w:val="clear" w:fill="auto"/>
         <w:spacing w:lineRule="auto" w:line="259" w:before="0" w:after="0"/>
         <w:ind w:hanging="2610" w:left="2520" w:right="0"/>
@@ -5952,7 +5870,6 @@
         <w:keepLines w:val="false"/>
         <w:pageBreakBefore w:val="false"/>
         <w:widowControl/>
-        <w:pBdr/>
         <w:shd w:val="clear" w:fill="auto"/>
         <w:spacing w:lineRule="auto" w:line="259" w:before="0" w:after="160"/>
         <w:ind w:hanging="0" w:left="2520" w:right="0"/>
@@ -8628,6 +8545,7 @@
     <w:qFormat/>
     <w:pPr>
       <w:widowControl/>
+      <w:suppressAutoHyphens w:val="true"/>
       <w:bidi w:val="0"/>
       <w:spacing w:lineRule="auto" w:line="259" w:before="0" w:after="160"/>
       <w:jc w:val="left"/>
@@ -9072,6 +8990,7 @@
     <w:qFormat/>
     <w:pPr>
       <w:widowControl/>
+      <w:suppressAutoHyphens w:val="true"/>
       <w:bidi w:val="0"/>
       <w:spacing w:lineRule="auto" w:line="259" w:before="0" w:after="160"/>
       <w:jc w:val="left"/>

</xml_diff>